<commit_message>
Pełne polskie tłumaczenie witryny AU (Dostępny Uniwersytet)
Przetłumaczono strony HTML, napisy VTT, komunikaty skryptów oraz dokumenty
Word/PowerPoint/PDF. Celowe błędy dostępności w wersji Before/Przed zachowane
(demonstracja); przetłumaczono jedynie treść. Dostępny PDF wygenerowany na nowo
(tagged, PDF/UA-1 compliant wg veraPDF). Sekcje obcojęzyczne (es/fr) zachowane.

Oryginał: University of Washington (AccessComputing), licencja CC BY-NC-SA 4.0.
</commit_message>
<xml_diff>
--- a/documents/syllabus_NOTaccessible.docx
+++ b/documents/syllabus_NOTaccessible.docx
@@ -79,7 +79,8 @@
           <w:sz w:val="32"/>
           <w:szCs w:val="32"/>
         </w:rPr>
-        <w:t>Introduction to Physics</w:t>
+        <w:t xml:space="preserve">Wprowadzenie do fizyki
+Sylabus kursu</w:t>
       </w:r>
       <w:r>
         <w:rPr>
@@ -90,7 +91,7 @@
           <w:szCs w:val="32"/>
         </w:rPr>
         <w:br/>
-        <w:t>Course Syllabus</w:t>
+        <w:t/>
       </w:r>
     </w:p>
     <w:p>
@@ -111,28 +112,28 @@
           <w:sz w:val="28"/>
           <w:szCs w:val="28"/>
         </w:rPr>
-        <w:t>Textbook</w:t>
+        <w:t xml:space="preserve">Podręcznik</w:t>
       </w:r>
     </w:p>
     <w:p>
       <w:r>
-        <w:t xml:space="preserve">Our sole text for this course will be </w:t>
+        <w:t xml:space="preserve">Jedynym podręcznikiem do tego kursu będzie </w:t>
       </w:r>
       <w:hyperlink r:id="rId6" w:history="1">
         <w:r>
           <w:rPr>
             <w:rStyle w:val="Hyperlink"/>
           </w:rPr>
-          <w:t>Introduction to Physics, Second Edition</w:t>
+          <w:t>Wprowadzenie do fizyki, wydanie drugie</w:t>
         </w:r>
       </w:hyperlink>
       <w:r>
-        <w:t xml:space="preserve">, authored by the instructor. </w:t>
+        <w:t xml:space="preserve">, autorstwa prowadzącego. </w:t>
       </w:r>
     </w:p>
     <w:p>
       <w:r>
-        <w:t>Course Objectives</w:t>
+        <w:t xml:space="preserve">Cele kursu</w:t>
       </w:r>
     </w:p>
     <w:p>
@@ -147,25 +148,25 @@
         <w:rPr>
           <w:rFonts w:ascii="Cascadia Mono" w:hAnsi="Cascadia Mono" w:cs="Cascadia Mono"/>
         </w:rPr>
-        <w:t>●</w:t>
+        <w:t xml:space="preserve">● Zapoznanie studentów z podstawowymi zasadami fizyki</w:t>
       </w:r>
       <w:r>
         <w:rPr>
           <w:rFonts w:ascii="Cascadia Mono" w:hAnsi="Cascadia Mono" w:cs="Cascadia Mono"/>
         </w:rPr>
-        <w:t xml:space="preserve"> </w:t>
+        <w:t xml:space="preserve"/>
       </w:r>
       <w:r>
         <w:rPr>
           <w:rFonts w:cstheme="minorHAnsi"/>
         </w:rPr>
-        <w:t>To</w:t>
+        <w:t/>
       </w:r>
       <w:r>
         <w:rPr>
           <w:rFonts w:cstheme="minorHAnsi"/>
         </w:rPr>
-        <w:t xml:space="preserve"> offer students exposure to basic principles of Physics</w:t>
+        <w:t xml:space="preserve"/>
       </w:r>
     </w:p>
     <w:p>
@@ -180,19 +181,19 @@
         <w:rPr>
           <w:rFonts w:ascii="Cascadia Mono" w:hAnsi="Cascadia Mono" w:cs="Cascadia Mono"/>
         </w:rPr>
-        <w:t>●</w:t>
+        <w:t xml:space="preserve">● Zapewnienie studentom bogatych, skłaniających do myślenia dyskusji podczas wykładów</w:t>
       </w:r>
       <w:r>
         <w:rPr>
           <w:rFonts w:ascii="Cascadia Mono" w:hAnsi="Cascadia Mono" w:cs="Cascadia Mono"/>
         </w:rPr>
-        <w:t xml:space="preserve"> </w:t>
+        <w:t xml:space="preserve"/>
       </w:r>
       <w:r>
         <w:rPr>
           <w:rFonts w:cstheme="minorHAnsi"/>
         </w:rPr>
-        <w:t>To provide students with rich, thought-provoking discussions during laboratory sessions</w:t>
+        <w:t/>
       </w:r>
     </w:p>
     <w:p>
@@ -207,19 +208,19 @@
         <w:rPr>
           <w:rFonts w:ascii="Cascadia Mono" w:hAnsi="Cascadia Mono" w:cs="Cascadia Mono"/>
         </w:rPr>
-        <w:t>●</w:t>
+        <w:t xml:space="preserve">● Zapewnienie studentom możliwości uczenia się przez doświadczenie podczas zajęć laboratoryjnych</w:t>
       </w:r>
       <w:r>
         <w:rPr>
           <w:rFonts w:ascii="Cascadia Mono" w:hAnsi="Cascadia Mono" w:cs="Cascadia Mono"/>
         </w:rPr>
-        <w:t xml:space="preserve"> </w:t>
+        <w:t xml:space="preserve"/>
       </w:r>
       <w:r>
         <w:rPr>
           <w:rFonts w:cstheme="minorHAnsi"/>
         </w:rPr>
-        <w:t>To provide students with experiential learning opportunities during laboratory sessions</w:t>
+        <w:t/>
       </w:r>
     </w:p>
     <w:p>
@@ -249,7 +250,7 @@
           <w:sz w:val="28"/>
           <w:szCs w:val="28"/>
         </w:rPr>
-        <w:t>Class Schedule</w:t>
+        <w:t xml:space="preserve">Harmonogram zajęć</w:t>
       </w:r>
     </w:p>
     <w:tbl>
@@ -295,7 +296,7 @@
               <w:rPr>
                 <w:rFonts w:cstheme="minorHAnsi"/>
               </w:rPr>
-              <w:t>Week</w:t>
+              <w:t xml:space="preserve">Tydzień</w:t>
             </w:r>
           </w:p>
         </w:tc>
@@ -315,7 +316,7 @@
               <w:rPr>
                 <w:rFonts w:cstheme="minorHAnsi"/>
               </w:rPr>
-              <w:t>Topic</w:t>
+              <w:t xml:space="preserve">Temat</w:t>
             </w:r>
           </w:p>
         </w:tc>
@@ -335,7 +336,7 @@
               <w:rPr>
                 <w:rFonts w:cstheme="minorHAnsi"/>
               </w:rPr>
-              <w:t>Reading Assignment</w:t>
+              <w:t xml:space="preserve">Zadana lektura</w:t>
             </w:r>
           </w:p>
         </w:tc>
@@ -413,7 +414,7 @@
               <w:rPr>
                 <w:rFonts w:cstheme="minorHAnsi"/>
               </w:rPr>
-              <w:t>Chapter 1</w:t>
+              <w:t xml:space="preserve">Rozdział 1</w:t>
             </w:r>
           </w:p>
         </w:tc>
@@ -478,7 +479,7 @@
               <w:rPr>
                 <w:rFonts w:cstheme="minorHAnsi"/>
               </w:rPr>
-              <w:t>Chapters 2-3</w:t>
+              <w:t xml:space="preserve">Rozdziały 2-3</w:t>
             </w:r>
           </w:p>
         </w:tc>
@@ -556,7 +557,7 @@
               <w:rPr>
                 <w:rFonts w:cstheme="minorHAnsi"/>
               </w:rPr>
-              <w:t>Chapters 4-7</w:t>
+              <w:t xml:space="preserve">Rozdziały 4-7</w:t>
             </w:r>
           </w:p>
         </w:tc>
@@ -621,7 +622,7 @@
               <w:rPr>
                 <w:rFonts w:cstheme="minorHAnsi"/>
               </w:rPr>
-              <w:t>Chapters 8-10</w:t>
+              <w:t xml:space="preserve">Rozdziały 8-10</w:t>
             </w:r>
           </w:p>
         </w:tc>
@@ -776,7 +777,7 @@
               <w:rPr>
                 <w:rFonts w:cstheme="minorHAnsi"/>
               </w:rPr>
-              <w:t>Chapters 15-18</w:t>
+              <w:t xml:space="preserve">Rozdziały 15-18</w:t>
             </w:r>
           </w:p>
         </w:tc>
@@ -879,7 +880,7 @@
           <w:sz w:val="28"/>
           <w:szCs w:val="28"/>
         </w:rPr>
-        <w:t>Grades</w:t>
+        <w:t xml:space="preserve">Oceny</w:t>
       </w:r>
     </w:p>
     <w:p>
@@ -892,7 +893,7 @@
         <w:rPr>
           <w:rFonts w:cstheme="minorHAnsi"/>
         </w:rPr>
-        <w:t>Grades will be assigned on a ten-point scale (90 to 100 is an A, 80 to 89 is a B, etc.). Homework, exams, and projects will be weighted as follows:</w:t>
+        <w:t xml:space="preserve">Oceny będą przyznawane w skali dziesięciopunktowej (90 do 100 to 5, 80 do 89 to 4 itd.). Prace domowe, egzaminy i projekty będą ważone następująco:</w:t>
       </w:r>
     </w:p>
     <w:tbl>
@@ -939,7 +940,7 @@
                 <w:bCs/>
                 <w:color w:val="FFFFFF" w:themeColor="background1"/>
               </w:rPr>
-              <w:t>Homework</w:t>
+              <w:t xml:space="preserve">Prace domowe</w:t>
             </w:r>
           </w:p>
         </w:tc>
@@ -967,7 +968,7 @@
                 <w:bCs/>
                 <w:color w:val="FFFFFF" w:themeColor="background1"/>
               </w:rPr>
-              <w:t>Exams</w:t>
+              <w:t xml:space="preserve">Egzaminy</w:t>
             </w:r>
           </w:p>
         </w:tc>
@@ -995,7 +996,7 @@
                 <w:bCs/>
                 <w:color w:val="FFFFFF" w:themeColor="background1"/>
               </w:rPr>
-              <w:t>Projects</w:t>
+              <w:t xml:space="preserve">Projekty</w:t>
             </w:r>
           </w:p>
         </w:tc>
@@ -1083,7 +1084,7 @@
                 <w:b/>
                 <w:bCs/>
               </w:rPr>
-              <w:t>Final</w:t>
+              <w:t xml:space="preserve">Końcowy</w:t>
             </w:r>
           </w:p>
         </w:tc>
@@ -1152,7 +1153,7 @@
                 <w:b/>
                 <w:bCs/>
               </w:rPr>
-              <w:t>Final</w:t>
+              <w:t xml:space="preserve">Końcowy</w:t>
             </w:r>
           </w:p>
         </w:tc>

</xml_diff>